<commit_message>
Chore: Slightly modified resume
</commit_message>
<xml_diff>
--- a/portfolio_media/Giannakopoulos_Christos.docx
+++ b/portfolio_media/Giannakopoulos_Christos.docx
@@ -1934,14 +1934,6 @@
       </w:r>
       <w:r>
         <w:t xml:space="preserve">   </w:t>
-      </w:r>
-      <w:r>
-        <w:rPr>
-          <w:rFonts w:ascii="Calibri" w:hAnsi="Calibri"/>
-          <w:color w:val="444444"/>
-          <w:sz w:val="20"/>
-        </w:rPr>
-        <w:t>Summer 2025</w:t>
       </w:r>
     </w:p>
     <w:p>
@@ -2279,7 +2271,7 @@
   <w:abstractNum w:abstractNumId="8" w15:restartNumberingAfterBreak="0">
     <w:nsid w:val="FFFFFF89"/>
     <w:multiLevelType w:val="singleLevel"/>
-    <w:tmpl w:val="43044642"/>
+    <w:tmpl w:val="26C0116E"/>
     <w:lvl w:ilvl="0">
       <w:start w:val="1"/>
       <w:numFmt w:val="bullet"/>

</xml_diff>